<commit_message>
Deploy preview for PR 547 🛫
</commit_message>
<xml_diff>
--- a/pr-preview/pr-547/vignettes/articles/version-crosswalk-1.3-to-1.4.docx
+++ b/pr-preview/pr-547/vignettes/articles/version-crosswalk-1.3-to-1.4.docx
@@ -3049,7 +3049,7 @@
         <w:rPr>
           <w:rStyle w:val="CommentTok"/>
         </w:rPr>
-        <w:t xml:space="preserve">#&gt;     age id    antigen_iso   value</w:t>
+        <w:t xml:space="preserve">#&gt;     age id    antigen_iso value</w:t>
       </w:r>
       <w:r>
         <w:br/>
@@ -3058,7 +3058,7 @@
         <w:rPr>
           <w:rStyle w:val="CommentTok"/>
         </w:rPr>
-        <w:t xml:space="preserve">#&gt;   &lt;dbl&gt; &lt;chr&gt; &lt;chr&gt;         &lt;dbl&gt;</w:t>
+        <w:t xml:space="preserve">#&gt;   &lt;dbl&gt; &lt;chr&gt; &lt;chr&gt;       &lt;dbl&gt;</w:t>
       </w:r>
       <w:r>
         <w:br/>
@@ -3067,7 +3067,7 @@
         <w:rPr>
           <w:rStyle w:val="CommentTok"/>
         </w:rPr>
-        <w:t xml:space="preserve">#&gt; 1 10.2  1     HlyE_IgA      0.306</w:t>
+        <w:t xml:space="preserve">#&gt; 1  8.65 1     HlyE_IgA    0.488</w:t>
       </w:r>
       <w:r>
         <w:br/>
@@ -3076,7 +3076,7 @@
         <w:rPr>
           <w:rStyle w:val="CommentTok"/>
         </w:rPr>
-        <w:t xml:space="preserve">#&gt; 2 10.2  1     HlyE_IgG    165.   </w:t>
+        <w:t xml:space="preserve">#&gt; 2  8.65 1     HlyE_IgG    0.691</w:t>
       </w:r>
       <w:r>
         <w:br/>
@@ -3085,7 +3085,7 @@
         <w:rPr>
           <w:rStyle w:val="CommentTok"/>
         </w:rPr>
-        <w:t xml:space="preserve">#&gt; 3 12.1  2     HlyE_IgA      7.56 </w:t>
+        <w:t xml:space="preserve">#&gt; 3 18.8  2     HlyE_IgA    0.398</w:t>
       </w:r>
       <w:r>
         <w:br/>
@@ -3094,7 +3094,7 @@
         <w:rPr>
           <w:rStyle w:val="CommentTok"/>
         </w:rPr>
-        <w:t xml:space="preserve">#&gt; 4 12.1  2     HlyE_IgG     42.3  </w:t>
+        <w:t xml:space="preserve">#&gt; 4 18.8  2     HlyE_IgG    4.80 </w:t>
       </w:r>
       <w:r>
         <w:br/>
@@ -3103,7 +3103,7 @@
         <w:rPr>
           <w:rStyle w:val="CommentTok"/>
         </w:rPr>
-        <w:t xml:space="preserve">#&gt; 5  0.75 3     HlyE_IgA      0.497</w:t>
+        <w:t xml:space="preserve">#&gt; 5 15.8  3     HlyE_IgA    0.582</w:t>
       </w:r>
       <w:r>
         <w:br/>
@@ -3112,7 +3112,7 @@
         <w:rPr>
           <w:rStyle w:val="CommentTok"/>
         </w:rPr>
-        <w:t xml:space="preserve">#&gt; 6  0.75 3     HlyE_IgG      0.617</w:t>
+        <w:t xml:space="preserve">#&gt; 6 15.8  3     HlyE_IgG    1.02</w:t>
       </w:r>
       <w:r>
         <w:br/>

</xml_diff>